<commit_message>
some naming modifications, CVs added
</commit_message>
<xml_diff>
--- a/public/CV/Kaloyan_Kostadinov_CV.docx
+++ b/public/CV/Kaloyan_Kostadinov_CV.docx
@@ -161,7 +161,7 @@
     </w:p>
     <w:tbl>
       <w:tblPr>
-        <w:tblW w:w="11046" w:type="dxa"/>
+        <w:tblW w:w="11118" w:type="dxa"/>
         <w:tblBorders>
           <w:top w:val="none" w:sz="0" w:space="0" w:color="FFFFFF"/>
           <w:left w:val="none" w:sz="0" w:space="0" w:color="FFFFFF"/>
@@ -177,16 +177,16 @@
         <w:tblLook w:val="0000" w:firstRow="0" w:lastRow="0" w:firstColumn="0" w:lastColumn="0" w:noHBand="0" w:noVBand="0"/>
       </w:tblPr>
       <w:tblGrid>
-        <w:gridCol w:w="3474"/>
-        <w:gridCol w:w="7572"/>
+        <w:gridCol w:w="3496"/>
+        <w:gridCol w:w="7622"/>
       </w:tblGrid>
       <w:tr>
         <w:trPr>
-          <w:trHeight w:val="1000"/>
+          <w:trHeight w:val="1006"/>
         </w:trPr>
         <w:tc>
           <w:tcPr>
-            <w:tcW w:w="3474" w:type="dxa"/>
+            <w:tcW w:w="3496" w:type="dxa"/>
             <w:tcBorders>
               <w:top w:val="none" w:sz="0" w:space="0" w:color="FFFFFF"/>
               <w:left w:val="none" w:sz="0" w:space="0" w:color="FFFFFF"/>
@@ -910,7 +910,7 @@
         </w:tc>
         <w:tc>
           <w:tcPr>
-            <w:tcW w:w="7572" w:type="dxa"/>
+            <w:tcW w:w="7622" w:type="dxa"/>
             <w:tcBorders>
               <w:top w:val="none" w:sz="0" w:space="0" w:color="FFFFFF"/>
               <w:left w:val="none" w:sz="0" w:space="0" w:color="FFFFFF"/>
@@ -1087,16 +1087,7 @@
                 <w:sz w:val="22"/>
                 <w:szCs w:val="22"/>
               </w:rPr>
-              <w:t xml:space="preserve">Mobilis </w:t>
-            </w:r>
-            <w:r>
-              <w:rPr>
-                <w:rFonts w:ascii="Calibri" w:eastAsia="Calibri" w:hAnsi="Calibri" w:cs="Calibri"/>
-                <w:i/>
-                <w:iCs/>
-                <w:color w:val="6B6260"/>
-              </w:rPr>
-              <w:t>- Creator</w:t>
+              <w:t>Mobilis</w:t>
             </w:r>
             <w:r>
               <w:rPr>
@@ -1247,16 +1238,7 @@
                 <w:sz w:val="22"/>
                 <w:szCs w:val="22"/>
               </w:rPr>
-              <w:t xml:space="preserve">MindReel </w:t>
-            </w:r>
-            <w:r>
-              <w:rPr>
-                <w:rFonts w:ascii="Calibri" w:eastAsia="Calibri" w:hAnsi="Calibri" w:cs="Calibri"/>
-                <w:i/>
-                <w:iCs/>
-                <w:color w:val="6B6260"/>
-              </w:rPr>
-              <w:t>- Creator</w:t>
+              <w:t>MindReel</w:t>
             </w:r>
             <w:r>
               <w:rPr>
@@ -1309,7 +1291,30 @@
                 <w:rFonts w:ascii="Calibri" w:eastAsia="Calibri" w:hAnsi="Calibri" w:cs="Calibri"/>
                 <w:color w:val="1A1414"/>
               </w:rPr>
-              <w:t>Recommendation platform that analyzes live EEG brainwave signals and user preferences in order to understand psycho-emotional state, stress levels</w:t>
+              <w:t>Recommendation platform that analyzes live EEG brainwave signals</w:t>
+            </w:r>
+            <w:r>
+              <w:rPr>
+                <w:rFonts w:ascii="Calibri" w:eastAsia="Calibri" w:hAnsi="Calibri" w:cs="Calibri"/>
+                <w:color w:val="1A1414"/>
+                <w:lang w:val="en-US"/>
+              </w:rPr>
+              <w:t xml:space="preserve"> </w:t>
+            </w:r>
+            <w:r>
+              <w:rPr>
+                <w:rFonts w:ascii="Calibri" w:eastAsia="Calibri" w:hAnsi="Calibri" w:cs="Calibri"/>
+                <w:color w:val="1A1414"/>
+                <w:lang w:val="en-US"/>
+              </w:rPr>
+              <w:t>(using NeuroSky MindWave Mobile 2)</w:t>
+            </w:r>
+            <w:r>
+              <w:rPr>
+                <w:rFonts w:ascii="Calibri" w:eastAsia="Calibri" w:hAnsi="Calibri" w:cs="Calibri"/>
+                <w:color w:val="1A1414"/>
+              </w:rPr>
+              <w:t xml:space="preserve"> and user preferences in order to understand psycho-emotional state, stress levels</w:t>
             </w:r>
             <w:r>
               <w:rPr>
@@ -1502,16 +1507,7 @@
                 <w:sz w:val="22"/>
                 <w:szCs w:val="22"/>
               </w:rPr>
-              <w:t xml:space="preserve">NutriFit </w:t>
-            </w:r>
-            <w:r>
-              <w:rPr>
-                <w:rFonts w:ascii="Calibri" w:eastAsia="Calibri" w:hAnsi="Calibri" w:cs="Calibri"/>
-                <w:i/>
-                <w:iCs/>
-                <w:color w:val="6B6260"/>
-              </w:rPr>
-              <w:t>- Creator</w:t>
+              <w:t>NutriFit</w:t>
             </w:r>
             <w:r>
               <w:rPr>
@@ -1591,7 +1587,29 @@
                 <w:color w:val="1A1414"/>
                 <w:lang w:val="en-US"/>
               </w:rPr>
-              <w:t>Personalized meal plans generated and evaluated by comparing both models based on their deviation from user-specific calorie and macronutrient targets</w:t>
+              <w:t>Personalized meal plans generated by both models</w:t>
+            </w:r>
+            <w:r>
+              <w:rPr>
+                <w:rFonts w:ascii="Calibri" w:eastAsia="Calibri" w:hAnsi="Calibri" w:cs="Calibri"/>
+                <w:color w:val="1A1414"/>
+              </w:rPr>
+              <w:t xml:space="preserve"> </w:t>
+            </w:r>
+            <w:r>
+              <w:rPr>
+                <w:rFonts w:ascii="Calibri" w:eastAsia="Calibri" w:hAnsi="Calibri" w:cs="Calibri"/>
+                <w:color w:val="1A1414"/>
+              </w:rPr>
+              <w:t>and evaluated</w:t>
+            </w:r>
+            <w:r>
+              <w:rPr>
+                <w:rFonts w:ascii="Calibri" w:eastAsia="Calibri" w:hAnsi="Calibri" w:cs="Calibri"/>
+                <w:color w:val="1A1414"/>
+                <w:lang w:val="en-US"/>
+              </w:rPr>
+              <w:t xml:space="preserve"> based on their deviation from user-specific calorie and macronutrient targets</w:t>
             </w:r>
           </w:p>
           <w:p>
@@ -1675,7 +1693,7 @@
                 <w:color w:val="1A1414"/>
                 <w:lang w:val="en-US"/>
               </w:rPr>
-              <w:t>user's height and recommends whether to reduce, maintain, or gain weight, with guidance on diet and activity adjustments</w:t>
+              <w:t>user's height and recommends whether to reduce, maintain, or gain weight, with guidance on diet adjustments</w:t>
             </w:r>
           </w:p>
           <w:p>
@@ -1799,16 +1817,7 @@
                 <w:sz w:val="22"/>
                 <w:szCs w:val="22"/>
               </w:rPr>
-              <w:t xml:space="preserve">TikFluence </w:t>
-            </w:r>
-            <w:r>
-              <w:rPr>
-                <w:rFonts w:ascii="Calibri" w:eastAsia="Calibri" w:hAnsi="Calibri" w:cs="Calibri"/>
-                <w:i/>
-                <w:iCs/>
-                <w:color w:val="6B6260"/>
-              </w:rPr>
-              <w:t>- Creator</w:t>
+              <w:t>TikFluence</w:t>
             </w:r>
             <w:r>
               <w:rPr>
@@ -2211,7 +2220,46 @@
                 <w:sz w:val="18"/>
                 <w:szCs w:val="18"/>
               </w:rPr>
-              <w:t>National Autumn Tournament in IT (НЕТИТ „Джон Атанасов“)</w:t>
+              <w:t xml:space="preserve">National Autumn Tournament in </w:t>
+            </w:r>
+            <w:r>
+              <w:rPr>
+                <w:rFonts w:ascii="Calibri" w:eastAsia="Calibri" w:hAnsi="Calibri" w:cs="Calibri"/>
+                <w:b/>
+                <w:bCs/>
+                <w:i/>
+                <w:iCs/>
+                <w:color w:val="6B6260"/>
+                <w:sz w:val="18"/>
+                <w:szCs w:val="18"/>
+              </w:rPr>
+              <w:t>Information Technologies</w:t>
+            </w:r>
+            <w:r>
+              <w:rPr>
+                <w:rFonts w:ascii="Calibri" w:eastAsia="Calibri" w:hAnsi="Calibri" w:cs="Calibri"/>
+                <w:b/>
+                <w:bCs/>
+                <w:i/>
+                <w:iCs/>
+                <w:color w:val="6B6260"/>
+                <w:sz w:val="18"/>
+                <w:szCs w:val="18"/>
+              </w:rPr>
+              <w:t xml:space="preserve"> </w:t>
+            </w:r>
+            <w:r>
+              <w:rPr>
+                <w:rFonts w:ascii="Calibri" w:eastAsia="Calibri" w:hAnsi="Calibri" w:cs="Calibri"/>
+                <w:b/>
+                <w:bCs/>
+                <w:i/>
+                <w:iCs/>
+                <w:color w:val="6B6260"/>
+                <w:sz w:val="18"/>
+                <w:szCs w:val="18"/>
+              </w:rPr>
+              <w:t>(НЕТИТ „Джон Атанасов“)</w:t>
             </w:r>
           </w:p>
           <w:p>
@@ -2354,7 +2402,7 @@
                 <w:iCs/>
                 <w:color w:val="6B6260"/>
               </w:rPr>
-              <w:t>No formal work experience yet</w:t>
+              <w:t>I am at the beginning of my professional journey and am</w:t>
             </w:r>
             <w:r>
               <w:rPr>
@@ -2362,9 +2410,8 @@
                 <w:i/>
                 <w:iCs/>
                 <w:color w:val="6B6260"/>
-                <w:lang w:val="en-US"/>
-              </w:rPr>
-              <w:t xml:space="preserve"> -</w:t>
+              </w:rPr>
+              <w:t xml:space="preserve"> </w:t>
             </w:r>
             <w:r>
               <w:rPr>
@@ -2373,7 +2420,7 @@
                 <w:iCs/>
                 <w:color w:val="6B6260"/>
               </w:rPr>
-              <w:t xml:space="preserve"> actively seeking a junior developer role or internship. The projects </w:t>
+              <w:t>actively seeking a junior developer role or internship.</w:t>
             </w:r>
             <w:r>
               <w:rPr>
@@ -2381,9 +2428,8 @@
                 <w:i/>
                 <w:iCs/>
                 <w:color w:val="6B6260"/>
-                <w:lang w:val="en-US"/>
-              </w:rPr>
-              <w:t>above</w:t>
+              </w:rPr>
+              <w:t xml:space="preserve"> </w:t>
             </w:r>
             <w:r>
               <w:rPr>
@@ -2392,7 +2438,7 @@
                 <w:iCs/>
                 <w:color w:val="6B6260"/>
               </w:rPr>
-              <w:t xml:space="preserve"> showcase</w:t>
+              <w:t xml:space="preserve">The projects </w:t>
             </w:r>
             <w:r>
               <w:rPr>
@@ -2402,7 +2448,7 @@
                 <w:color w:val="6B6260"/>
                 <w:lang w:val="en-US"/>
               </w:rPr>
-              <w:t xml:space="preserve"> my</w:t>
+              <w:t>above</w:t>
             </w:r>
             <w:r>
               <w:rPr>
@@ -2411,7 +2457,44 @@
                 <w:iCs/>
                 <w:color w:val="6B6260"/>
               </w:rPr>
-              <w:t xml:space="preserve"> hands-on experience</w:t>
+              <w:t xml:space="preserve"> showcase</w:t>
+            </w:r>
+            <w:r>
+              <w:rPr>
+                <w:rFonts w:ascii="Calibri" w:eastAsia="Calibri" w:hAnsi="Calibri" w:cs="Calibri"/>
+                <w:i/>
+                <w:iCs/>
+                <w:color w:val="6B6260"/>
+                <w:lang w:val="en-US"/>
+              </w:rPr>
+              <w:t xml:space="preserve"> my</w:t>
+            </w:r>
+            <w:r>
+              <w:rPr>
+                <w:rFonts w:ascii="Calibri" w:eastAsia="Calibri" w:hAnsi="Calibri" w:cs="Calibri"/>
+                <w:i/>
+                <w:iCs/>
+                <w:color w:val="6B6260"/>
+              </w:rPr>
+              <w:t xml:space="preserve"> hands-on</w:t>
+            </w:r>
+            <w:r>
+              <w:rPr>
+                <w:rFonts w:ascii="Calibri" w:eastAsia="Calibri" w:hAnsi="Calibri" w:cs="Calibri"/>
+                <w:i/>
+                <w:iCs/>
+                <w:color w:val="6B6260"/>
+              </w:rPr>
+              <w:t xml:space="preserve"> </w:t>
+            </w:r>
+            <w:r>
+              <w:rPr>
+                <w:rFonts w:ascii="Calibri" w:eastAsia="Calibri" w:hAnsi="Calibri" w:cs="Calibri"/>
+                <w:i/>
+                <w:iCs/>
+                <w:color w:val="6B6260"/>
+              </w:rPr>
+              <w:t>experience in developing software solutions</w:t>
             </w:r>
           </w:p>
         </w:tc>

</xml_diff>